<commit_message>
Expand project report scenario
</commit_message>
<xml_diff>
--- a/docs/project_report.docx
+++ b/docs/project_report.docx
@@ -253,6 +253,7 @@
               <w:rPr>
                 <w:rFonts w:ascii="Malgun Gothic" w:hAnsi="Malgun Gothic"/>
               </w:rPr>
+              <w:t>Borg/XGBoost 기반 Failure Risk 예측 및 AiOpsLab Local Cloud 이전 연구</w:t>
             </w:r>
           </w:p>
         </w:tc>
@@ -1457,7 +1458,7 @@
         <w:rPr>
           <w:rFonts w:ascii="Malgun Gothic" w:hAnsi="Malgun Gothic"/>
         </w:rPr>
-        <w:t>대규모 분산 컴퓨팅 환경에서는 task failure를 사후 대응으로만 처리할 경우 resource 낭비, service degradation, 운영 비용 증가가 동시에 발생한다. 특히 실제 운영 환경에서는 장애 원인을 정확히 분리하기 어렵고, failure 직전 signal을 조기에 포착해 선제 대응하는 능력이 중요하다. 본 과제는 Google Borg trace를 기반으로 task usage, event, machine signal을 통합하고, XGBoost 기반의 failure risk prediction pipeline을 구축해 Local Cloud 환경으로 이전 가능한 offline ML 체계를 정리하는 것을 목표로 한다.</w:t>
+        <w:t>대규모 분산 컴퓨팅 환경에서는 task failure를 사후 대응으로만 처리할 경우 resource 낭비, service degradation, 운영 비용 증가가 동시에 발생한다. 특히 실제 운영 환경에서는 장애 원인을 정확히 분리하기 어렵고, failure 직전 signal을 조기에 포착해 선제 대응하는 능력이 중요하다. 본 과제는 Google Borg trace를 기반으로 task usage, event, machine signal을 통합하고, XGBoost를 포함한 여러 ML 모델로 failure risk prediction pipeline을 구축한 뒤, 향후 Microsoft의 open-source tool인 AiOpsLab 기반 Local Cloud 환경으로 이전 가능한 offline ML 체계를 정리하는 것을 목표로 한다.</w:t>
       </w:r>
     </w:p>
     <w:p>
@@ -1470,7 +1471,7 @@
         <w:rPr>
           <w:rFonts w:ascii="Malgun Gothic" w:hAnsi="Malgun Gothic"/>
         </w:rPr>
-        <w:t>본 과제의 핵심 문제의식은 "대규모 시스템에서 failure를 얼마나 이르게, 얼마나 신뢰 가능하게 예측할 수 있는가"이다. 이를 위해 raw trace를 단순 분석용 data가 아니라 model training이 가능한 structured dataset으로 재구성하고, multi-horizon target, feature engineering, evaluation report까지 포함한 end-to-end workflow를 설계하였다.</w:t>
+        <w:t>본 과제의 핵심 문제의식은 "대규모 시스템에서 failure를 얼마나 이르게, 얼마나 신뢰 가능하게 예측할 수 있는가"이다. 이를 위해 raw trace를 단순 분석용 data가 아니라 model training이 가능한 structured dataset으로 재구성하고, multi-horizon target, feature engineering, model comparison, evaluation report, agent-based workflow 계획까지 포함한 end-to-end workflow를 설계하였다.</w:t>
       </w:r>
     </w:p>
     <w:p>
@@ -1481,7 +1482,7 @@
         <w:rPr>
           <w:rFonts w:ascii="Malgun Gothic" w:hAnsi="Malgun Gothic"/>
         </w:rPr>
-        <w:t>본 과제는 Borg trace의 raw shard를 수집하고, 이를 flatten, join, feature engineering하여 multi-horizon failure prediction dataset으로 재구성한 뒤, XGBoost 기반 risk prediction model을 학습하는 프로젝트이다. 예측 horizon은 5분, 15분, 30분, 45분, 60분으로 구성하였으며, 각 window마다 별도 model을 학습해 short-horizon과 long-horizon signal의 차이를 비교하였다. 또한 class imbalance 대응, tuning, repaired-label 재학습, bilingual reporting까지 포함해 실제 ML engineering 프로젝트에 가까운 형태로 진행하였다.</w:t>
+        <w:t>본 과제는 Borg trace의 raw shard를 수집하고, 이를 flatten, join, feature engineering하여 multi-horizon failure prediction dataset으로 재구성한 뒤, XGBoost 기반 risk prediction model을 학습하는 프로젝트로 시작하였다. 예측 horizon은 15분, 30분, 45분, 60분을 기본 비교 축으로 두고, 필요 시 5분 horizon을 보조 지표로 활용한다. 이후 동일 dataset에 대해 3~4개의 ML 모델을 학습시켜 성능과 해석 가능성을 비교하고, 장기적으로는 agent-based preprocessing, analysis, forecast pipeline으로 확장하는 방향을 목표로 한다.</w:t>
       </w:r>
     </w:p>
     <w:p>
@@ -1494,7 +1495,7 @@
         <w:rPr>
           <w:rFonts w:ascii="Malgun Gothic" w:hAnsi="Malgun Gothic"/>
         </w:rPr>
-        <w:t>최종적으로는 단순 정확도 비교가 아니라, PR-AUC(AP), Precision@K, Recall@K, feature importance, data quality 이슈, Local Cloud 적용 시 주의사항까지 함께 정리하여 non-ML developer도 이해할 수 있는 운영형 보고 체계를 만드는 데 초점을 두었다.</w:t>
+        <w:t>최종적으로는 단순 정확도 비교가 아니라, PR-AUC(AP), Precision@K, Recall@K, feature importance, data quality 이슈, Local Cloud 적용 시 주의사항, model 간 비교 분석까지 함께 정리하여 non-ML developer도 이해할 수 있는 운영형 보고 체계를 만드는 데 초점을 두었다.</w:t>
       </w:r>
     </w:p>
     <w:p>
@@ -1559,11 +1560,13 @@
         <w:br/>
         <w:t>1. Borg trace 기반 failure prediction dataset 및 feature store 구축</w:t>
         <w:br/>
-        <w:t>2. horizon별 XGBoost failure risk model 학습 및 평가</w:t>
+        <w:t>2. 동일 data를 활용한 3~4개 ML 모델 학습 및 비교 분석</w:t>
         <w:br/>
-        <w:t>3. model artifact, feature importance, validation prediction, bilingual 보고서 정리</w:t>
+        <w:t>3. 15m/30m/45m/60m 예측 horizon별 성능 비교</w:t>
         <w:br/>
-        <w:t>4. 향후 Local Cloud 환경에 이식 가능한 feature semantics 및 운영 해석 체계 정리</w:t>
+        <w:t>4. model artifact, feature importance, validation prediction, bilingual 보고서 정리</w:t>
+        <w:br/>
+        <w:t>5. 향후 AiOpsLab 기반 Local Cloud 환경에 이식 가능한 feature semantics 및 agent workflow 설계</w:t>
       </w:r>
     </w:p>
     <w:p>
@@ -1576,11 +1579,11 @@
         </w:rPr>
         <w:t>정량 목표 (측정 가능한 것)</w:t>
         <w:br/>
-        <w:t>1. `5m/15m/30m/45m/60m` horizon별 XGBoost model 학습 완료</w:t>
+        <w:t>1. `15m/30m/45m/60m` horizon별 baseline XGBoost model 학습 완료</w:t>
         <w:br/>
-        <w:t>2. baseline model family에 대한 AP, Precision@K, Recall@K 산출</w:t>
+        <w:t>2. 동일 dataset으로 최소 3개 이상의 ML 모델 학습 및 metric 비교</w:t>
         <w:br/>
-        <w:t>3. feature importance 및 validation prediction artifact 저장 자동화</w:t>
+        <w:t>3. AP, Precision@K, Recall@K, feature importance, validation prediction artifact 저장 자동화</w:t>
         <w:br/>
         <w:t>4. end-to-end pipeline의 resumable 실행 및 detailed log 확보</w:t>
       </w:r>
@@ -1619,9 +1622,11 @@
         <w:br/>
         <w:t>1. 대규모 trace data를 실제 운영형 ML pipeline으로 변환하는 경험 확보</w:t>
         <w:br/>
-        <w:t>2. data engineering, label quality audit, model tuning, reporting이 연결된 end-to-end workflow 이해</w:t>
+        <w:t>2. data engineering, label quality audit, model tuning, model comparison, reporting이 연결된 end-to-end workflow 이해</w:t>
         <w:br/>
-        <w:t>3. Local Cloud 이식 시 필요한 feature semantics와 evaluation caution 정리</w:t>
+        <w:t>3. 향후 preprocessing agent, analysis agent, forecast agent로 확장 가능한 구조 정립</w:t>
+        <w:br/>
+        <w:t>4. AiOpsLab 기반 Local Cloud 이식 시 필요한 feature semantics와 evaluation caution 정리</w:t>
       </w:r>
     </w:p>
     <w:p>
@@ -1692,7 +1697,9 @@
         <w:br/>
         <w:t>2. model artifact 및 bilingual technical documentation 정리</w:t>
         <w:br/>
-        <w:t>3. 필요 시 교내 학술 발표 또는 포스터 형태의 결과 공유</w:t>
+        <w:t>3. 동일 data에 대한 다중 모델 비교 결과표와 해석 report 작성</w:t>
+        <w:br/>
+        <w:t>4. 필요 시 교내 학술 발표 또는 포스터 형태의 결과 공유</w:t>
       </w:r>
     </w:p>
     <w:p>
@@ -1736,6 +1743,8 @@
         <w:t>- usage / event / machine parquet 정규화</w:t>
         <w:br/>
         <w:t>- cluster별 joined dataset 생성</w:t>
+        <w:br/>
+        <w:t>- 추후 agent 입력용 intermediate artifact 분리</w:t>
       </w:r>
     </w:p>
     <w:p>
@@ -1804,6 +1813,8 @@
         <w:br/>
         <w:t>- XGBoost baseline model family 학습</w:t>
         <w:br/>
+        <w:t>- 동일 data에 대해 Random Forest, LightGBM 또는 다른 tree/sequence 계열 후보 모델 비교</w:t>
+        <w:br/>
         <w:t>- negative downsampling, scale_pos_weight, time-based split 적용</w:t>
         <w:br/>
         <w:t>- tuning candidate 비교 및 tuned retrain 수행</w:t>
@@ -1826,6 +1837,8 @@
         <w:t>5. Evaluation &amp; Reporting</w:t>
         <w:br/>
         <w:t>- AP, Precision@0.1%, Precision@1%, Recall@0.1%, Recall@1% 계산</w:t>
+        <w:br/>
+        <w:t>- model 간 horizon별 비교 분석</w:t>
         <w:br/>
         <w:t>- feature importance 분석</w:t>
         <w:br/>
@@ -1855,6 +1868,8 @@
         <w:t>- model directory별 README 및 artifact registry</w:t>
         <w:br/>
         <w:t>- Korean / English 보고서 체계 정비</w:t>
+        <w:br/>
+        <w:t>- 추후 agent communication log 연동 가능 구조 확보</w:t>
       </w:r>
     </w:p>
     <w:p>
@@ -1873,11 +1888,13 @@
         </w:rPr>
         <w:t>7. Local Cloud Transfer Readiness</w:t>
         <w:br/>
-        <w:t>- Borg feature와 Local Cloud feature의 semantic mapping 정리</w:t>
+        <w:t>- Borg feature와 AiOpsLab Local Cloud feature의 semantic mapping 정리</w:t>
         <w:br/>
         <w:t>- sampled evaluation의 한계와 threshold 재검증 필요성 명시</w:t>
         <w:br/>
         <w:t>- 운영 적용 전 추가 검증 항목 정의</w:t>
+        <w:br/>
+        <w:t>- agent-based evaluation / forecast workflow 도입 계획 정리</w:t>
       </w:r>
     </w:p>
     <w:p>
@@ -1902,7 +1919,7 @@
         <w:rPr>
           <w:rFonts w:ascii="Malgun Gothic" w:hAnsi="Malgun Gothic"/>
         </w:rPr>
-        <w:t>1. Borg trace로부터 task failure prediction에 필요한 usable feature가 무엇인지 조사하고, usage / event / machine signal을 통합한 feature set을 설계한다.</w:t>
+        <w:t>1. Borg trace로부터 task failure prediction에 필요한 usable feature가 무엇인지 조사하고, usage / event / machine signal을 통합한 feature set을 설계한다. 이후 같은 feature set을 여러 ML 모델에 공통 입력으로 사용해 model 비교가 가능하도록 한다.</w:t>
       </w:r>
     </w:p>
     <w:p>
@@ -1916,7 +1933,7 @@
         <w:rPr>
           <w:rFonts w:ascii="Malgun Gothic" w:hAnsi="Malgun Gothic"/>
         </w:rPr>
-        <w:t>2. baseline XGBoost model을 horizon별로 학습하고, metric 변화를 비교하여 short-horizon과 long-horizon의 차이를 분석한다.</w:t>
+        <w:t>2. baseline XGBoost model을 horizon별로 학습하고, 15m, 30m, 45m, 60m 기준 metric 변화를 비교하여 short-horizon과 longer-horizon의 차이를 분석한다.</w:t>
       </w:r>
     </w:p>
     <w:p>
@@ -1927,7 +1944,7 @@
         <w:rPr>
           <w:rFonts w:ascii="Malgun Gothic" w:hAnsi="Malgun Gothic"/>
         </w:rPr>
-        <w:t>3. tuning candidate를 비교해 overfitting을 줄이면서 ranking quality를 유지하는 parameter profile을 찾는다.</w:t>
+        <w:t>3. tuning candidate를 비교해 overfitting을 줄이면서 ranking quality를 유지하는 parameter profile을 찾고, 이후 다른 모델군과도 동일 조건에서 비교한다.</w:t>
       </w:r>
     </w:p>
     <w:p>
@@ -1955,7 +1972,7 @@
         <w:rPr>
           <w:rFonts w:ascii="Malgun Gothic" w:hAnsi="Malgun Gothic"/>
         </w:rPr>
-        <w:t>5. feature importance를 바탕으로 model이 어떤 operational signal에 가장 의존하는지 분석하고, Local Cloud 이전 시 유지해야 할 핵심 feature semantics를 정리한다.</w:t>
+        <w:t>5. feature importance를 바탕으로 model이 어떤 operational signal에 가장 의존하는지 분석하고, 향후 Local Cloud 이전 시 유지해야 할 핵심 feature semantics를 정리한다. 또한 preprocessing agent, analysis agent, forecast agent가 어떤 입력과 출력을 가져야 하는지 초기 시나리오를 설계한다.</w:t>
       </w:r>
     </w:p>
     <w:p/>
@@ -1982,11 +1999,13 @@
         </w:rPr>
         <w:t>1. 대규모 분산 시스템에서 task failure를 사전에 예측하는 pipeline 설계 경험을 확보할 수 있다.</w:t>
         <w:br/>
-        <w:t>2. 단순 model training이 아니라 data repair, label audit, evaluation caution까지 포함한 실제 ML engineering 과정을 학습할 수 있다.</w:t>
+        <w:t>2. 단순 model training이 아니라 data repair, label audit, evaluation caution, model comparison까지 포함한 실제 ML engineering 과정을 학습할 수 있다.</w:t>
         <w:br/>
-        <w:t>3. feature semantics를 정리했기 때문에 향후 Borg와 다른 Local Cloud 환경 사이의 feature mapping과 재검증 작업을 체계적으로 진행할 수 있다.</w:t>
+        <w:t>3. feature semantics를 정리했기 때문에 향후 Borg와 AiOpsLab Local Cloud 환경 사이의 feature mapping과 재검증 작업을 체계적으로 진행할 수 있다.</w:t>
         <w:br/>
-        <w:t>4. multi-horizon model을 통해 즉시 위험 탐지와 중기 위험 탐지의 차이를 비교할 수 있다.</w:t>
+        <w:t>4. multi-horizon model을 통해 15분 단위 예측 window 변화에 따른 성능 차이를 비교할 수 있다.</w:t>
+        <w:br/>
+        <w:t>5. agent 기반 확장 시 preprocessing, 분석, 예측 단계를 분리하는 운영 시나리오를 준비할 수 있다.</w:t>
       </w:r>
     </w:p>
     <w:p>
@@ -2052,7 +2071,7 @@
         <w:rPr>
           <w:rFonts w:ascii="Malgun Gothic" w:hAnsi="Malgun Gothic"/>
         </w:rPr>
-        <w:t>활용 데이터: Google Borg Cluster Trace, cluster `b`~`g` 중심 processed parquet dataset</w:t>
+        <w:t>활용 데이터: Google Borg Cluster Trace, cluster `b`~`g` 중심 processed parquet dataset, 향후 Microsoft AiOpsLab에서 수집할 Local Cloud trace / metric data</w:t>
       </w:r>
     </w:p>
     <w:p>
@@ -2066,7 +2085,7 @@
         <w:rPr>
           <w:rFonts w:ascii="Malgun Gothic" w:hAnsi="Malgun Gothic"/>
         </w:rPr>
-        <w:t>활용 도구: Python, Polars, XGBoost, shell wrapper, Git, Markdown / DOCX report</w:t>
+        <w:t>활용 도구: Python, Polars, XGBoost, shell wrapper, Git, Markdown / DOCX report, 향후 AiOpsLab environment 및 agent orchestration 구성 요소</w:t>
       </w:r>
     </w:p>
     <w:p>
@@ -2091,7 +2110,7 @@
         <w:rPr>
           <w:rFonts w:ascii="Malgun Gothic" w:hAnsi="Malgun Gothic"/>
         </w:rPr>
-        <w:t>1. 문헌 및 기술 조사: failure prediction, class imbalance, gradient boosting, early stopping, feature engineering 관련 자료를 조사한다.</w:t>
+        <w:t>1. 문헌 및 기술 조사: failure prediction, class imbalance, gradient boosting, early stopping, feature engineering, model comparison, AIOps workflow 관련 자료를 조사한다.</w:t>
       </w:r>
     </w:p>
     <w:p>
@@ -2119,7 +2138,7 @@
         <w:rPr>
           <w:rFonts w:ascii="Malgun Gothic" w:hAnsi="Malgun Gothic"/>
         </w:rPr>
-        <w:t>3. 실험 및 분석: horizon별 model을 학습하고 tuning candidate를 비교하며, repaired-label 재학습 전후 차이를 분석한다.</w:t>
+        <w:t>3. 실험 및 분석: horizon별 model을 학습하고 tuning candidate를 비교하며, repaired-label 재학습 전후 차이를 분석한다. 이후 동일 data를 대상으로 여러 모델을 학습시켜 comparative benchmark를 만든다.</w:t>
       </w:r>
     </w:p>
     <w:p>
@@ -2134,7 +2153,7 @@
         <w:rPr>
           <w:rFonts w:ascii="Malgun Gothic" w:hAnsi="Malgun Gothic"/>
         </w:rPr>
-        <w:t>핵심 적용 기법: XGBoost, feature engineering, time-based split, negative downsampling, scale_pos_weight, early stopping, hyperparameter tuning</w:t>
+        <w:t>핵심 적용 기법: XGBoost, feature engineering, time-based split, negative downsampling, scale_pos_weight, early stopping, hyperparameter tuning, multi-model benchmark 설계</w:t>
       </w:r>
     </w:p>
     <w:p>
@@ -2149,7 +2168,7 @@
         <w:rPr>
           <w:rFonts w:ascii="Malgun Gothic" w:hAnsi="Malgun Gothic"/>
         </w:rPr>
-        <w:t>활용 모델: XGBoost classifier (multi-horizon family), tuned profile `regularized_balanced` 기반 retrain</w:t>
+        <w:t>활용 모델: XGBoost classifier (multi-horizon family)를 우선 구축하고, 이후 동일 feature set으로 3~4개 모델을 추가 학습해 comparative benchmark를 구성한다.</w:t>
       </w:r>
     </w:p>
     <w:p>
@@ -2323,7 +2342,7 @@
               <w:rPr>
                 <w:rFonts w:ascii="Malgun Gothic" w:hAnsi="Malgun Gothic"/>
               </w:rPr>
-              <w:t>프로젝트 총괄, data pipeline 설계, model training orchestration, 최종 보고서 통합</w:t>
+              <w:t>프로젝트 총괄, data pipeline 설계, model training orchestration, 결과 통합 및 최종 보고서 리드</w:t>
             </w:r>
           </w:p>
         </w:tc>
@@ -2391,7 +2410,7 @@
               <w:rPr>
                 <w:rFonts w:ascii="Malgun Gothic" w:hAnsi="Malgun Gothic"/>
               </w:rPr>
-              <w:t>data engineering, flatten/join/feature build 지원, data validation 및 schema 점검</w:t>
+              <w:t>preprocessing agent 설계, data engineering, flatten/join/feature build 지원, data validation 및 schema 점검</w:t>
             </w:r>
           </w:p>
         </w:tc>
@@ -2458,7 +2477,7 @@
               <w:rPr>
                 <w:rFonts w:ascii="Malgun Gothic" w:hAnsi="Malgun Gothic"/>
               </w:rPr>
-              <w:t>model tuning, metric 분석, feature importance 해석, evaluation report 작성</w:t>
+              <w:t>analysis agent 설계, model tuning, metric 비교 분석, feature importance 해석, evaluation report 작성</w:t>
             </w:r>
           </w:p>
         </w:tc>
@@ -2525,7 +2544,7 @@
               <w:rPr>
                 <w:rFonts w:ascii="Malgun Gothic" w:hAnsi="Malgun Gothic"/>
               </w:rPr>
-              <w:t>Local Cloud 적용 설계, 운영 시나리오 정리, 발표 자료 및 문서 정제</w:t>
+              <w:t>forecast agent 설계, Local Cloud/AiOpsLab 적용 시나리오 정리, 발표 자료 및 문서 정제</w:t>
             </w:r>
           </w:p>
         </w:tc>
@@ -2567,7 +2586,7 @@
         </w:rPr>
         <w:t>1. 기술 현황 조사</w:t>
         <w:br/>
-        <w:t>- failure prediction, class imbalance 대응, gradient boosting 기반 risk model 사례를 조사한다.</w:t>
+        <w:t>- failure prediction, class imbalance 대응, gradient boosting 기반 risk model 사례와 AIOps agent workflow 사례를 조사한다.</w:t>
       </w:r>
     </w:p>
     <w:p>
@@ -2585,6 +2604,8 @@
         <w:t>2. 데이터 파이프라인 설계</w:t>
         <w:br/>
         <w:t>- raw shard download, flatten, join, feature build 과정을 설계하고 reproducible pipeline으로 정리한다.</w:t>
+        <w:br/>
+        <w:t>- 추후 agent별 입력 산출물을 분리할 수 있게 intermediate layer를 정의한다.</w:t>
       </w:r>
     </w:p>
     <w:p>
@@ -2601,6 +2622,8 @@
         <w:t>3. Label 및 Feature 설계</w:t>
         <w:br/>
         <w:t>- future failure target과 task-level / machine-level / collection-level feature를 정의한다.</w:t>
+        <w:br/>
+        <w:t>- 15분 단위로 1시간까지의 horizon 비교 체계를 마련한다.</w:t>
       </w:r>
     </w:p>
     <w:p>
@@ -2630,9 +2653,9 @@
         <w:rPr>
           <w:rFonts w:ascii="Malgun Gothic" w:hAnsi="Malgun Gothic"/>
         </w:rPr>
-        <w:t>5. Tuning 및 Overfitting 제어</w:t>
+        <w:t>5. 다중 Model 학습 및 Overfitting 제어</w:t>
         <w:br/>
-        <w:t>- tuning candidate를 비교하고 early stopping, regularization, subsample parameter의 효과를 분석한다.</w:t>
+        <w:t>- 동일 data에 대해 3~4개 모델을 학습시키고, early stopping, regularization, subsample parameter의 효과를 함께 비교한다.</w:t>
       </w:r>
     </w:p>
     <w:p>
@@ -2662,9 +2685,9 @@
         <w:rPr>
           <w:rFonts w:ascii="Malgun Gothic" w:hAnsi="Malgun Gothic"/>
         </w:rPr>
-        <w:t>7. 시스템 구현 및 artifact 정리</w:t>
+        <w:t>7. Agent 확장 준비 및 artifact 정리</w:t>
         <w:br/>
-        <w:t>- model, metric, feature importance, validation prediction, bilingual report를 정리하고 reproducible structure를 만든다.</w:t>
+        <w:t>- preprocessing agent, analysis agent, forecast agent 시나리오를 정리하고, model / metric / feature importance / validation prediction / bilingual report를 체계화한다.</w:t>
       </w:r>
     </w:p>
     <w:p>
@@ -2681,7 +2704,7 @@
         </w:rPr>
         <w:t>8. 성능 검증 및 해석</w:t>
         <w:br/>
-        <w:t>- window별 metric, feature importance, data-quality effect를 비교 분석한다.</w:t>
+        <w:t>- horizon별 metric, model 간 비교, feature importance, data-quality effect를 비교 분석한다.</w:t>
       </w:r>
     </w:p>
     <w:p>
@@ -2697,7 +2720,7 @@
         </w:rPr>
         <w:t>9. Local Cloud 이전 준비</w:t>
         <w:br/>
-        <w:t>- Local Cloud에서 유지할 feature semantics, evaluation caution, threshold 검증 필요사항을 정리한다.</w:t>
+        <w:t>- AiOpsLab 기반 Local Cloud에서 유지할 feature semantics, evaluation caution, threshold 검증 필요사항을 정리한다.</w:t>
       </w:r>
     </w:p>
     <w:p>
@@ -2715,6 +2738,8 @@
         <w:t>10. 보고서 작성 및 발표</w:t>
         <w:br/>
         <w:t>- 최종 보고서, project report, bilingual md 문서, 발표 자료를 정리한다.</w:t>
+        <w:br/>
+        <w:t>- 팀원별 별도 repository 및 README 기반 결과 추합 구조를 반영한다.</w:t>
       </w:r>
     </w:p>
     <w:p>
@@ -2746,6 +2771,8 @@
         <w:t>1. horizon별 validation metric을 비교해 short-horizon과 long-horizon model의 ranking 특성을 분석한다.</w:t>
         <w:br/>
         <w:t>2. baseline, tuning candidate, repaired-label retrain 사이의 차이를 비교해 data quality와 hyperparameter 설정의 영향을 검토한다.</w:t>
+        <w:br/>
+        <w:t>3. 동일 data를 사용한 다중 모델 결과를 비교해 어떤 model family가 더 적합한지 정리한다.</w:t>
       </w:r>
     </w:p>
     <w:p>
@@ -2760,7 +2787,7 @@
         <w:rPr>
           <w:rFonts w:ascii="Malgun Gothic" w:hAnsi="Malgun Gothic"/>
         </w:rPr>
-        <w:t>3. feature importance, validation prediction, sampled evaluation의 한계를 함께 제시하여 결과를 과신하지 않도록 하고, Local Cloud 적용 전 unsampled holdout 평가 및 threshold 검증이 필요함을 명확히 기술한다.</w:t>
+        <w:t>4. feature importance, validation prediction, sampled evaluation의 한계를 함께 제시하여 결과를 과신하지 않도록 하고, AiOpsLab Local Cloud 적용 전 unsampled holdout 평가 및 threshold 검증이 필요함을 명확히 기술한다.</w:t>
       </w:r>
     </w:p>
     <w:p>
@@ -3137,7 +3164,7 @@
               <w:rPr>
                 <w:rFonts w:ascii="Malgun Gothic" w:hAnsi="Malgun Gothic"/>
               </w:rPr>
-              <w:t>Feature engineering 및 label 설계</w:t>
+              <w:t>15m~60m Label 및 Feature 설계</w:t>
             </w:r>
           </w:p>
         </w:tc>
@@ -3228,7 +3255,7 @@
               <w:rPr>
                 <w:rFonts w:ascii="Malgun Gothic" w:hAnsi="Malgun Gothic"/>
               </w:rPr>
-              <w:t>Baseline XGBoost model 학습 및 평가</w:t>
+              <w:t>Baseline XGBoost 및 추가 모델 학습</w:t>
             </w:r>
           </w:p>
         </w:tc>
@@ -3255,6 +3282,7 @@
               <w:rPr>
                 <w:rFonts w:ascii="Malgun Gothic" w:hAnsi="Malgun Gothic"/>
               </w:rPr>
+              <w:t>●</w:t>
             </w:r>
           </w:p>
         </w:tc>
@@ -3281,7 +3309,6 @@
               <w:rPr>
                 <w:rFonts w:ascii="Malgun Gothic" w:hAnsi="Malgun Gothic"/>
               </w:rPr>
-              <w:t>●</w:t>
             </w:r>
           </w:p>
         </w:tc>
@@ -3319,7 +3346,7 @@
               <w:rPr>
                 <w:rFonts w:ascii="Malgun Gothic" w:hAnsi="Malgun Gothic"/>
               </w:rPr>
-              <w:t>Tuning, early stopping, regularization 비교</w:t>
+              <w:t>모델 비교 분석 및 overfitting 제어</w:t>
             </w:r>
           </w:p>
         </w:tc>
@@ -3411,7 +3438,7 @@
               <w:rPr>
                 <w:rFonts w:ascii="Malgun Gothic" w:hAnsi="Malgun Gothic"/>
               </w:rPr>
-              <w:t>Data repair 및 repaired-label retrain</w:t>
+              <w:t>시뮬레이션 및 agent communication 설계</w:t>
             </w:r>
           </w:p>
         </w:tc>
@@ -3451,6 +3478,7 @@
               <w:rPr>
                 <w:rFonts w:ascii="Malgun Gothic" w:hAnsi="Malgun Gothic"/>
               </w:rPr>
+              <w:t>●</w:t>
             </w:r>
           </w:p>
         </w:tc>
@@ -3502,7 +3530,7 @@
               <w:rPr>
                 <w:rFonts w:ascii="Malgun Gothic" w:hAnsi="Malgun Gothic"/>
               </w:rPr>
-              <w:t>최종 보고서 작성 및 발표 준비</w:t>
+              <w:t>최종 결과 분석, 보고서 작성 및 발표 준비</w:t>
             </w:r>
           </w:p>
         </w:tc>

</xml_diff>